<commit_message>
optimize with new model, update readme files
</commit_message>
<xml_diff>
--- a/teaching/dxp-syllabus-creator/示例：机械原理 课程教学大纲.docx
+++ b/teaching/dxp-syllabus-creator/示例：机械原理 课程教学大纲.docx
@@ -12,8 +12,6 @@
           <w:rFonts w:hint="default" w:ascii="Times New Roman" w:hAnsi="Times New Roman" w:eastAsia="宋体" w:cs="Times New Roman"/>
         </w:rPr>
       </w:pPr>
-      <w:bookmarkStart w:id="2" w:name="_GoBack"/>
-      <w:bookmarkEnd w:id="2"/>
       <w:bookmarkStart w:id="0" w:name="_Toc5973827"/>
       <w:r>
         <w:rPr>
@@ -562,14 +560,6 @@
                 <w:lang w:val="en-US" w:eastAsia="zh-CN"/>
               </w:rPr>
             </w:pPr>
-            <w:r>
-              <w:rPr>
-                <w:rFonts w:hint="eastAsia" w:cs="Times New Roman" w:eastAsiaTheme="minorEastAsia"/>
-                <w:szCs w:val="21"/>
-                <w:lang w:val="en-US" w:eastAsia="zh-CN"/>
-              </w:rPr>
-              <w:t>专业基础必修</w:t>
-            </w:r>
           </w:p>
         </w:tc>
         <w:tc>
@@ -625,14 +615,6 @@
                 <w:lang w:val="en-US" w:eastAsia="zh-CN"/>
               </w:rPr>
             </w:pPr>
-            <w:r>
-              <w:rPr>
-                <w:rFonts w:hint="eastAsia" w:cs="Times New Roman" w:eastAsiaTheme="minorEastAsia"/>
-                <w:szCs w:val="21"/>
-                <w:lang w:val="en-US" w:eastAsia="zh-CN"/>
-              </w:rPr>
-              <w:t>徐楠</w:t>
-            </w:r>
           </w:p>
         </w:tc>
       </w:tr>
@@ -694,13 +676,6 @@
                 <w:lang w:val="en-US"/>
               </w:rPr>
             </w:pPr>
-            <w:r>
-              <w:rPr>
-                <w:rFonts w:hint="default" w:ascii="Times New Roman" w:hAnsi="Times New Roman" w:cs="Times New Roman" w:eastAsiaTheme="minorEastAsia"/>
-                <w:szCs w:val="21"/>
-              </w:rPr>
-              <w:t>机械原理</w:t>
-            </w:r>
           </w:p>
         </w:tc>
       </w:tr>
@@ -777,14 +752,6 @@
                 <w:lang w:val="en-US"/>
               </w:rPr>
             </w:pPr>
-            <w:r>
-              <w:rPr>
-                <w:rFonts w:hint="default" w:ascii="Times New Roman" w:hAnsi="Times New Roman" w:eastAsia="宋体" w:cs="Times New Roman"/>
-                <w:sz w:val="21"/>
-                <w:szCs w:val="21"/>
-              </w:rPr>
-              <w:t>Theory of Machines and Mechanisms</w:t>
-            </w:r>
           </w:p>
         </w:tc>
       </w:tr>
@@ -1240,29 +1207,6 @@
                 <w:szCs w:val="21"/>
               </w:rPr>
             </w:pPr>
-            <w:r>
-              <w:rPr>
-                <w:rFonts w:hint="eastAsia" w:cs="Times New Roman" w:eastAsiaTheme="minorEastAsia"/>
-                <w:szCs w:val="21"/>
-                <w:lang w:eastAsia="zh-CN"/>
-              </w:rPr>
-              <w:t>……</w:t>
-            </w:r>
-            <w:r>
-              <w:rPr>
-                <w:rFonts w:hint="eastAsia" w:cs="Times New Roman" w:eastAsiaTheme="minorEastAsia"/>
-                <w:szCs w:val="21"/>
-              </w:rPr>
-              <w:t>专业</w:t>
-            </w:r>
-            <w:r>
-              <w:rPr>
-                <w:rFonts w:hint="eastAsia" w:cs="Times New Roman" w:eastAsiaTheme="minorEastAsia"/>
-                <w:szCs w:val="21"/>
-                <w:lang w:val="en-US" w:eastAsia="zh-CN"/>
-              </w:rPr>
-              <w:t>大二学生</w:t>
-            </w:r>
           </w:p>
         </w:tc>
       </w:tr>
@@ -1323,13 +1267,6 @@
                 <w:szCs w:val="21"/>
               </w:rPr>
             </w:pPr>
-            <w:r>
-              <w:rPr>
-                <w:rFonts w:hint="default" w:cs="Times New Roman" w:eastAsiaTheme="minorEastAsia"/>
-                <w:szCs w:val="21"/>
-              </w:rPr>
-              <w:t>机械制图2、大学物理B、理论力学A</w:t>
-            </w:r>
           </w:p>
         </w:tc>
       </w:tr>
@@ -1503,123 +1440,6 @@
     </w:p>
     <w:p>
       <w:pPr>
-        <w:snapToGrid w:val="0"/>
-        <w:spacing w:line="300" w:lineRule="auto"/>
-        <w:ind w:firstLine="482" w:firstLineChars="200"/>
-        <w:rPr>
-          <w:rFonts w:hint="default" w:ascii="Times New Roman" w:hAnsi="Times New Roman" w:eastAsia="宋体" w:cs="Times New Roman"/>
-          <w:b/>
-          <w:bCs/>
-          <w:sz w:val="24"/>
-          <w:szCs w:val="24"/>
-        </w:rPr>
-      </w:pPr>
-      <w:r>
-        <w:rPr>
-          <w:rFonts w:hint="default" w:ascii="Times New Roman" w:hAnsi="Times New Roman" w:eastAsia="宋体" w:cs="Times New Roman"/>
-          <w:b/>
-          <w:bCs/>
-          <w:sz w:val="24"/>
-          <w:szCs w:val="24"/>
-        </w:rPr>
-        <w:t>1.</w:t>
-      </w:r>
-      <w:r>
-        <w:rPr>
-          <w:rFonts w:hint="default" w:ascii="Times New Roman" w:hAnsi="Times New Roman" w:eastAsia="宋体" w:cs="Times New Roman"/>
-          <w:b/>
-          <w:bCs/>
-          <w:sz w:val="24"/>
-          <w:szCs w:val="24"/>
-          <w:lang w:val="en-US" w:eastAsia="zh-CN"/>
-        </w:rPr>
-        <w:t xml:space="preserve"> </w:t>
-      </w:r>
-      <w:r>
-        <w:rPr>
-          <w:rFonts w:hint="default" w:ascii="Times New Roman" w:hAnsi="Times New Roman" w:eastAsia="宋体" w:cs="Times New Roman"/>
-          <w:b/>
-          <w:bCs/>
-          <w:sz w:val="24"/>
-          <w:szCs w:val="24"/>
-        </w:rPr>
-        <w:t>课程性质</w:t>
-      </w:r>
-    </w:p>
-    <w:p>
-      <w:pPr>
-        <w:snapToGrid w:val="0"/>
-        <w:spacing w:line="300" w:lineRule="auto"/>
-        <w:ind w:firstLine="480" w:firstLineChars="200"/>
-        <w:rPr>
-          <w:rFonts w:hint="default" w:ascii="Times New Roman" w:hAnsi="Times New Roman" w:eastAsia="宋体" w:cs="Times New Roman"/>
-          <w:sz w:val="24"/>
-          <w:szCs w:val="24"/>
-        </w:rPr>
-      </w:pPr>
-      <w:r>
-        <w:rPr>
-          <w:rFonts w:hint="default" w:ascii="Times New Roman" w:hAnsi="Times New Roman" w:eastAsia="宋体" w:cs="Times New Roman"/>
-          <w:sz w:val="24"/>
-          <w:szCs w:val="24"/>
-        </w:rPr>
-        <w:t>本课程是针对机械工程、机械电子工程以及车辆工程等专业开设的一门专业基础必修课。</w:t>
-      </w:r>
-      <w:r>
-        <w:rPr>
-          <w:rFonts w:hint="default" w:ascii="Times New Roman" w:hAnsi="Times New Roman" w:eastAsia="宋体" w:cs="Times New Roman"/>
-          <w:sz w:val="24"/>
-          <w:szCs w:val="24"/>
-          <w:lang w:val="en-US" w:eastAsia="zh-CN"/>
-        </w:rPr>
-        <w:t>主要介绍各种机械中的结构、运动学、动力学等共性问题以及各种常用机构</w:t>
-      </w:r>
-      <w:r>
-        <w:rPr>
-          <w:rFonts w:hint="default" w:ascii="Times New Roman" w:hAnsi="Times New Roman" w:eastAsia="宋体" w:cs="Times New Roman"/>
-          <w:sz w:val="24"/>
-          <w:szCs w:val="24"/>
-          <w:lang w:eastAsia="zh-CN"/>
-        </w:rPr>
-        <w:t>的</w:t>
-      </w:r>
-      <w:r>
-        <w:rPr>
-          <w:rFonts w:hint="default" w:ascii="Times New Roman" w:hAnsi="Times New Roman" w:eastAsia="宋体" w:cs="Times New Roman"/>
-          <w:sz w:val="24"/>
-          <w:szCs w:val="24"/>
-          <w:lang w:val="en-US" w:eastAsia="zh-CN"/>
-        </w:rPr>
-        <w:t>设计与分析方法</w:t>
-      </w:r>
-      <w:r>
-        <w:rPr>
-          <w:rFonts w:hint="default" w:ascii="Times New Roman" w:hAnsi="Times New Roman" w:eastAsia="宋体" w:cs="Times New Roman"/>
-          <w:sz w:val="24"/>
-          <w:szCs w:val="24"/>
-        </w:rPr>
-        <w:t>，为培养学生的机械</w:t>
-      </w:r>
-      <w:r>
-        <w:rPr>
-          <w:rFonts w:hint="default" w:ascii="Times New Roman" w:hAnsi="Times New Roman" w:eastAsia="宋体" w:cs="Times New Roman"/>
-          <w:sz w:val="24"/>
-          <w:szCs w:val="24"/>
-          <w:lang w:val="en-US" w:eastAsia="zh-CN"/>
-        </w:rPr>
-        <w:t>系统</w:t>
-      </w:r>
-      <w:r>
-        <w:rPr>
-          <w:rFonts w:hint="default" w:ascii="Times New Roman" w:hAnsi="Times New Roman" w:eastAsia="宋体" w:cs="Times New Roman"/>
-          <w:sz w:val="24"/>
-          <w:szCs w:val="24"/>
-        </w:rPr>
-        <w:t>设计能力做好铺垫。</w:t>
-      </w:r>
-    </w:p>
-    <w:p>
-      <w:pPr>
         <w:numPr>
           <w:ilvl w:val="0"/>
           <w:numId w:val="2"/>
@@ -1643,47 +1463,78 @@
           <w:sz w:val="24"/>
           <w:szCs w:val="24"/>
         </w:rPr>
-        <w:t>课程任务</w:t>
+        <w:t>课程性质</w:t>
       </w:r>
     </w:p>
     <w:p>
       <w:pPr>
-        <w:keepNext w:val="0"/>
-        <w:keepLines w:val="0"/>
-        <w:pageBreakBefore w:val="0"/>
         <w:widowControl w:val="0"/>
-        <w:kinsoku/>
-        <w:wordWrap/>
-        <w:overflowPunct/>
-        <w:topLinePunct w:val="0"/>
-        <w:autoSpaceDE/>
-        <w:autoSpaceDN/>
-        <w:bidi w:val="0"/>
-        <w:adjustRightInd/>
-        <w:snapToGrid/>
+        <w:numPr>
+          <w:numId w:val="0"/>
+        </w:numPr>
+        <w:snapToGrid w:val="0"/>
         <w:spacing w:line="300" w:lineRule="auto"/>
-        <w:ind w:firstLine="482"/>
-        <w:textAlignment w:val="auto"/>
+        <w:ind w:left="420" w:leftChars="0" w:firstLine="420" w:firstLineChars="0"/>
+        <w:jc w:val="both"/>
         <w:rPr>
           <w:rFonts w:hint="default" w:ascii="Times New Roman" w:hAnsi="Times New Roman" w:eastAsia="宋体" w:cs="Times New Roman"/>
+          <w:b/>
+          <w:bCs/>
           <w:sz w:val="24"/>
           <w:szCs w:val="24"/>
         </w:rPr>
       </w:pPr>
-      <w:r>
-        <w:rPr>
-          <w:rFonts w:hint="default" w:ascii="Times New Roman" w:hAnsi="Times New Roman" w:eastAsia="宋体" w:cs="Times New Roman"/>
-          <w:sz w:val="24"/>
-          <w:szCs w:val="24"/>
-        </w:rPr>
-        <w:t>掌握机构学和机械动力学的基本理论、基本知识和基本技能，初步具有拟定机械运动方案、分析和设计机构的能力。根据课程特点，将德育与教学内容有机融合，使学生在学习中受到有益的启示与熏陶。</w:t>
-      </w:r>
     </w:p>
     <w:p>
       <w:pPr>
         <w:numPr>
           <w:ilvl w:val="0"/>
-          <w:numId w:val="2"/>
+          <w:numId w:val="3"/>
+        </w:numPr>
+        <w:snapToGrid w:val="0"/>
+        <w:spacing w:line="300" w:lineRule="auto"/>
+        <w:ind w:firstLine="482" w:firstLineChars="200"/>
+        <w:rPr>
+          <w:rFonts w:hint="default" w:ascii="Times New Roman" w:hAnsi="Times New Roman" w:eastAsia="宋体" w:cs="Times New Roman"/>
+          <w:b/>
+          <w:bCs/>
+          <w:sz w:val="24"/>
+          <w:szCs w:val="24"/>
+        </w:rPr>
+      </w:pPr>
+      <w:r>
+        <w:rPr>
+          <w:rFonts w:hint="default" w:ascii="Times New Roman" w:hAnsi="Times New Roman" w:eastAsia="宋体" w:cs="Times New Roman"/>
+          <w:b/>
+          <w:bCs/>
+          <w:sz w:val="24"/>
+          <w:szCs w:val="24"/>
+        </w:rPr>
+        <w:t>课程任务</w:t>
+      </w:r>
+    </w:p>
+    <w:p>
+      <w:pPr>
+        <w:numPr>
+          <w:numId w:val="0"/>
+        </w:numPr>
+        <w:snapToGrid w:val="0"/>
+        <w:spacing w:line="300" w:lineRule="auto"/>
+        <w:ind w:left="420" w:leftChars="0" w:firstLine="420" w:firstLineChars="0"/>
+        <w:rPr>
+          <w:rFonts w:hint="default" w:ascii="Times New Roman" w:hAnsi="Times New Roman" w:eastAsia="宋体" w:cs="Times New Roman"/>
+          <w:b/>
+          <w:bCs/>
+          <w:sz w:val="24"/>
+          <w:szCs w:val="24"/>
+        </w:rPr>
+      </w:pPr>
+    </w:p>
+    <w:p>
+      <w:pPr>
+        <w:numPr>
+          <w:ilvl w:val="0"/>
+          <w:numId w:val="3"/>
         </w:numPr>
         <w:snapToGrid w:val="0"/>
         <w:spacing w:line="300" w:lineRule="auto"/>
@@ -1728,204 +1579,6 @@
         </w:rPr>
         <w:t>课程目标1：</w:t>
       </w:r>
-      <w:r>
-        <w:rPr>
-          <w:rFonts w:hint="default" w:ascii="Times New Roman" w:hAnsi="Times New Roman" w:eastAsia="宋体" w:cs="Times New Roman"/>
-          <w:sz w:val="24"/>
-          <w:szCs w:val="24"/>
-        </w:rPr>
-        <w:t>理解机械</w:t>
-      </w:r>
-      <w:r>
-        <w:rPr>
-          <w:rFonts w:hint="default" w:ascii="Times New Roman" w:hAnsi="Times New Roman" w:eastAsia="宋体" w:cs="Times New Roman"/>
-          <w:sz w:val="24"/>
-          <w:szCs w:val="24"/>
-          <w:lang w:val="en-US" w:eastAsia="zh-CN"/>
-        </w:rPr>
-        <w:t>和机构</w:t>
-      </w:r>
-      <w:r>
-        <w:rPr>
-          <w:rFonts w:hint="default" w:ascii="Times New Roman" w:hAnsi="Times New Roman" w:eastAsia="宋体" w:cs="Times New Roman"/>
-          <w:sz w:val="24"/>
-          <w:szCs w:val="24"/>
-        </w:rPr>
-        <w:t>的基本概念</w:t>
-      </w:r>
-      <w:r>
-        <w:rPr>
-          <w:rFonts w:hint="default" w:ascii="Times New Roman" w:hAnsi="Times New Roman" w:eastAsia="宋体" w:cs="Times New Roman"/>
-          <w:sz w:val="24"/>
-          <w:szCs w:val="24"/>
-          <w:lang w:eastAsia="zh-CN"/>
-        </w:rPr>
-        <w:t>、</w:t>
-      </w:r>
-      <w:r>
-        <w:rPr>
-          <w:rFonts w:hint="default" w:ascii="Times New Roman" w:hAnsi="Times New Roman" w:eastAsia="宋体" w:cs="Times New Roman"/>
-          <w:sz w:val="24"/>
-          <w:szCs w:val="24"/>
-          <w:lang w:val="en-US" w:eastAsia="zh-CN"/>
-        </w:rPr>
-        <w:t>机构运动原理，能</w:t>
-      </w:r>
-      <w:r>
-        <w:rPr>
-          <w:rFonts w:hint="default" w:ascii="Times New Roman" w:hAnsi="Times New Roman" w:eastAsia="宋体" w:cs="Times New Roman"/>
-          <w:sz w:val="24"/>
-          <w:szCs w:val="24"/>
-        </w:rPr>
-        <w:t>绘制机构运动简图</w:t>
-      </w:r>
-      <w:r>
-        <w:rPr>
-          <w:rFonts w:hint="default" w:ascii="Times New Roman" w:hAnsi="Times New Roman" w:eastAsia="宋体" w:cs="Times New Roman"/>
-          <w:sz w:val="24"/>
-          <w:szCs w:val="24"/>
-          <w:lang w:val="en-US" w:eastAsia="zh-CN"/>
-        </w:rPr>
-        <w:t>并</w:t>
-      </w:r>
-      <w:r>
-        <w:rPr>
-          <w:rFonts w:hint="default" w:ascii="Times New Roman" w:hAnsi="Times New Roman" w:eastAsia="宋体" w:cs="Times New Roman"/>
-          <w:sz w:val="24"/>
-          <w:szCs w:val="24"/>
-        </w:rPr>
-        <w:t>计算机构自由度</w:t>
-      </w:r>
-      <w:r>
-        <w:rPr>
-          <w:rFonts w:hint="default" w:ascii="Times New Roman" w:hAnsi="Times New Roman" w:eastAsia="宋体" w:cs="Times New Roman"/>
-          <w:sz w:val="24"/>
-          <w:szCs w:val="24"/>
-          <w:lang w:eastAsia="zh-CN"/>
-        </w:rPr>
-        <w:t>，</w:t>
-      </w:r>
-      <w:r>
-        <w:rPr>
-          <w:rFonts w:hint="default" w:ascii="Times New Roman" w:hAnsi="Times New Roman" w:eastAsia="宋体" w:cs="Times New Roman"/>
-          <w:sz w:val="24"/>
-          <w:szCs w:val="24"/>
-          <w:lang w:val="en-US" w:eastAsia="zh-CN"/>
-        </w:rPr>
-        <w:t>了解</w:t>
-      </w:r>
-      <w:r>
-        <w:rPr>
-          <w:rFonts w:hint="default" w:ascii="Times New Roman" w:hAnsi="Times New Roman" w:eastAsia="宋体" w:cs="Times New Roman"/>
-          <w:sz w:val="24"/>
-          <w:szCs w:val="24"/>
-        </w:rPr>
-        <w:t>机构的组成原理</w:t>
-      </w:r>
-      <w:r>
-        <w:rPr>
-          <w:rFonts w:hint="default" w:ascii="Times New Roman" w:hAnsi="Times New Roman" w:eastAsia="宋体" w:cs="Times New Roman"/>
-          <w:sz w:val="24"/>
-          <w:szCs w:val="24"/>
-          <w:lang w:eastAsia="zh-CN"/>
-        </w:rPr>
-        <w:t>，</w:t>
-      </w:r>
-      <w:r>
-        <w:rPr>
-          <w:rFonts w:hint="default" w:ascii="Times New Roman" w:hAnsi="Times New Roman" w:eastAsia="宋体" w:cs="Times New Roman"/>
-          <w:sz w:val="24"/>
-          <w:szCs w:val="24"/>
-          <w:lang w:val="en-US" w:eastAsia="zh-CN"/>
-        </w:rPr>
-        <w:t>掌握</w:t>
-      </w:r>
-      <w:r>
-        <w:rPr>
-          <w:rFonts w:hint="default" w:ascii="Times New Roman" w:hAnsi="Times New Roman" w:eastAsia="宋体" w:cs="Times New Roman"/>
-          <w:sz w:val="24"/>
-          <w:szCs w:val="24"/>
-        </w:rPr>
-        <w:t>常用机构运动</w:t>
-      </w:r>
-      <w:r>
-        <w:rPr>
-          <w:rFonts w:hint="default" w:ascii="Times New Roman" w:hAnsi="Times New Roman" w:eastAsia="宋体" w:cs="Times New Roman"/>
-          <w:sz w:val="24"/>
-          <w:szCs w:val="24"/>
-          <w:lang w:val="en-US" w:eastAsia="zh-CN"/>
-        </w:rPr>
-        <w:t>和</w:t>
-      </w:r>
-      <w:r>
-        <w:rPr>
-          <w:rFonts w:hint="default" w:ascii="Times New Roman" w:hAnsi="Times New Roman" w:eastAsia="宋体" w:cs="Times New Roman"/>
-          <w:sz w:val="24"/>
-          <w:szCs w:val="24"/>
-        </w:rPr>
-        <w:t>力、机械效率和自锁的分析方法</w:t>
-      </w:r>
-      <w:r>
-        <w:rPr>
-          <w:rFonts w:hint="default" w:ascii="Times New Roman" w:hAnsi="Times New Roman" w:eastAsia="宋体" w:cs="Times New Roman"/>
-          <w:sz w:val="24"/>
-          <w:szCs w:val="24"/>
-          <w:lang w:eastAsia="zh-CN"/>
-        </w:rPr>
-        <w:t>。</w:t>
-      </w:r>
-      <w:r>
-        <w:rPr>
-          <w:rFonts w:hint="default" w:ascii="Times New Roman" w:hAnsi="Times New Roman" w:eastAsia="宋体" w:cs="Times New Roman"/>
-          <w:sz w:val="24"/>
-          <w:szCs w:val="24"/>
-          <w:lang w:val="en-US" w:eastAsia="zh-CN"/>
-        </w:rPr>
-        <w:t>能够</w:t>
-      </w:r>
-      <w:r>
-        <w:rPr>
-          <w:rFonts w:hint="default" w:ascii="Times New Roman" w:hAnsi="Times New Roman" w:eastAsia="宋体" w:cs="Times New Roman"/>
-          <w:sz w:val="24"/>
-          <w:szCs w:val="24"/>
-        </w:rPr>
-        <w:t>利用机构自由度</w:t>
-      </w:r>
-      <w:r>
-        <w:rPr>
-          <w:rFonts w:hint="default" w:ascii="Times New Roman" w:hAnsi="Times New Roman" w:eastAsia="宋体" w:cs="Times New Roman"/>
-          <w:sz w:val="24"/>
-          <w:szCs w:val="24"/>
-          <w:lang w:val="en-US" w:eastAsia="zh-CN"/>
-        </w:rPr>
-        <w:t>和</w:t>
-      </w:r>
-      <w:r>
-        <w:rPr>
-          <w:rFonts w:hint="default" w:ascii="Times New Roman" w:hAnsi="Times New Roman" w:eastAsia="宋体" w:cs="Times New Roman"/>
-          <w:sz w:val="24"/>
-          <w:szCs w:val="24"/>
-        </w:rPr>
-        <w:t>机构的组成原理构造所需的机构型式</w:t>
-      </w:r>
-      <w:r>
-        <w:rPr>
-          <w:rFonts w:hint="default" w:ascii="Times New Roman" w:hAnsi="Times New Roman" w:eastAsia="宋体" w:cs="Times New Roman"/>
-          <w:sz w:val="24"/>
-          <w:szCs w:val="24"/>
-          <w:lang w:eastAsia="zh-CN"/>
-        </w:rPr>
-        <w:t>，</w:t>
-      </w:r>
-      <w:r>
-        <w:rPr>
-          <w:rFonts w:hint="default" w:ascii="Times New Roman" w:hAnsi="Times New Roman" w:eastAsia="宋体" w:cs="Times New Roman"/>
-          <w:sz w:val="24"/>
-          <w:szCs w:val="24"/>
-          <w:lang w:val="en-US" w:eastAsia="zh-CN"/>
-        </w:rPr>
-        <w:t>并对机构进行结构、运动和力学分析。</w:t>
-      </w:r>
     </w:p>
     <w:p>
       <w:pPr>
@@ -1948,66 +1601,6 @@
         </w:rPr>
         <w:t>课程目标2：</w:t>
       </w:r>
-      <w:r>
-        <w:rPr>
-          <w:rFonts w:hint="default" w:ascii="Times New Roman" w:hAnsi="Times New Roman" w:eastAsia="宋体" w:cs="Times New Roman"/>
-          <w:sz w:val="24"/>
-          <w:szCs w:val="24"/>
-        </w:rPr>
-        <w:t>掌握各种常用机构的性能、特点及适用场合，能够按已知几何条件和运动条件分析</w:t>
-      </w:r>
-      <w:r>
-        <w:rPr>
-          <w:rFonts w:hint="default" w:ascii="Times New Roman" w:hAnsi="Times New Roman" w:eastAsia="宋体" w:cs="Times New Roman"/>
-          <w:sz w:val="24"/>
-          <w:szCs w:val="24"/>
-          <w:lang w:val="en-US" w:eastAsia="zh-CN"/>
-        </w:rPr>
-        <w:t>和</w:t>
-      </w:r>
-      <w:r>
-        <w:rPr>
-          <w:rFonts w:hint="default" w:ascii="Times New Roman" w:hAnsi="Times New Roman" w:eastAsia="宋体" w:cs="Times New Roman"/>
-          <w:sz w:val="24"/>
-          <w:szCs w:val="24"/>
-        </w:rPr>
-        <w:t>设计平面连杆机构、凸轮机构、齿轮机构</w:t>
-      </w:r>
-      <w:r>
-        <w:rPr>
-          <w:rFonts w:hint="default" w:ascii="Times New Roman" w:hAnsi="Times New Roman" w:eastAsia="宋体" w:cs="Times New Roman"/>
-          <w:sz w:val="24"/>
-          <w:szCs w:val="24"/>
-          <w:lang w:eastAsia="zh-CN"/>
-        </w:rPr>
-        <w:t>、</w:t>
-      </w:r>
-      <w:r>
-        <w:rPr>
-          <w:rFonts w:hint="default" w:ascii="Times New Roman" w:hAnsi="Times New Roman" w:eastAsia="宋体" w:cs="Times New Roman"/>
-          <w:sz w:val="24"/>
-          <w:szCs w:val="24"/>
-          <w:lang w:val="en-US" w:eastAsia="zh-CN"/>
-        </w:rPr>
-        <w:t>间歇运动机构</w:t>
-      </w:r>
-      <w:r>
-        <w:rPr>
-          <w:rFonts w:hint="default" w:ascii="Times New Roman" w:hAnsi="Times New Roman" w:eastAsia="宋体" w:cs="Times New Roman"/>
-          <w:sz w:val="24"/>
-          <w:szCs w:val="24"/>
-        </w:rPr>
-        <w:t>等。</w:t>
-      </w:r>
-      <w:r>
-        <w:rPr>
-          <w:rFonts w:hint="default" w:ascii="Times New Roman" w:hAnsi="Times New Roman" w:eastAsia="宋体" w:cs="Times New Roman"/>
-          <w:sz w:val="24"/>
-          <w:szCs w:val="24"/>
-          <w:lang w:val="en-US" w:eastAsia="zh-CN"/>
-        </w:rPr>
-        <w:t>在机械设计过程中能够对各种常用机构进行选择和分析。</w:t>
-      </w:r>
     </w:p>
     <w:p>
       <w:pPr>
@@ -2028,224 +1621,6 @@
           <w:szCs w:val="24"/>
         </w:rPr>
         <w:t>课程目标3：</w:t>
-      </w:r>
-      <w:r>
-        <w:rPr>
-          <w:rFonts w:hint="default" w:ascii="Times New Roman" w:hAnsi="Times New Roman" w:eastAsia="宋体" w:cs="Times New Roman"/>
-          <w:sz w:val="24"/>
-          <w:szCs w:val="24"/>
-        </w:rPr>
-        <w:t>了解机械系统的设计过程</w:t>
-      </w:r>
-      <w:r>
-        <w:rPr>
-          <w:rFonts w:hint="default" w:ascii="Times New Roman" w:hAnsi="Times New Roman" w:eastAsia="宋体" w:cs="Times New Roman"/>
-          <w:sz w:val="24"/>
-          <w:szCs w:val="24"/>
-          <w:lang w:val="en-US" w:eastAsia="zh-CN"/>
-        </w:rPr>
-        <w:t>和一般步骤</w:t>
-      </w:r>
-      <w:r>
-        <w:rPr>
-          <w:rFonts w:hint="default" w:ascii="Times New Roman" w:hAnsi="Times New Roman" w:eastAsia="宋体" w:cs="Times New Roman"/>
-          <w:sz w:val="24"/>
-          <w:szCs w:val="24"/>
-        </w:rPr>
-        <w:t>，</w:t>
-      </w:r>
-      <w:r>
-        <w:rPr>
-          <w:rFonts w:hint="default" w:ascii="Times New Roman" w:hAnsi="Times New Roman" w:eastAsia="宋体" w:cs="Times New Roman"/>
-          <w:sz w:val="24"/>
-          <w:szCs w:val="24"/>
-          <w:lang w:val="en-US" w:eastAsia="zh-CN"/>
-        </w:rPr>
-        <w:t>计算轮系等传动机构的传动比，了解其传动特性</w:t>
-      </w:r>
-      <w:r>
-        <w:rPr>
-          <w:rFonts w:hint="default" w:ascii="Times New Roman" w:hAnsi="Times New Roman" w:eastAsia="宋体" w:cs="Times New Roman"/>
-          <w:sz w:val="24"/>
-          <w:szCs w:val="24"/>
-        </w:rPr>
-        <w:t>。</w:t>
-      </w:r>
-      <w:r>
-        <w:rPr>
-          <w:rFonts w:hint="default" w:ascii="Times New Roman" w:hAnsi="Times New Roman" w:eastAsia="宋体" w:cs="Times New Roman"/>
-          <w:sz w:val="24"/>
-          <w:szCs w:val="24"/>
-          <w:lang w:val="en-US" w:eastAsia="zh-CN"/>
-        </w:rPr>
-        <w:t>能够</w:t>
-      </w:r>
-      <w:r>
-        <w:rPr>
-          <w:rFonts w:hint="default" w:ascii="Times New Roman" w:hAnsi="Times New Roman" w:eastAsia="宋体" w:cs="Times New Roman"/>
-          <w:sz w:val="24"/>
-          <w:szCs w:val="24"/>
-        </w:rPr>
-        <w:t>初步</w:t>
-      </w:r>
-      <w:r>
-        <w:rPr>
-          <w:rFonts w:hint="default" w:ascii="Times New Roman" w:hAnsi="Times New Roman" w:eastAsia="宋体" w:cs="Times New Roman"/>
-          <w:sz w:val="24"/>
-          <w:szCs w:val="24"/>
-          <w:lang w:val="en-US" w:eastAsia="zh-CN"/>
-        </w:rPr>
-        <w:t>完成机械执行系统和传动系统的</w:t>
-      </w:r>
-      <w:r>
-        <w:rPr>
-          <w:rFonts w:hint="default" w:ascii="Times New Roman" w:hAnsi="Times New Roman" w:eastAsia="宋体" w:cs="Times New Roman"/>
-          <w:sz w:val="24"/>
-          <w:szCs w:val="24"/>
-        </w:rPr>
-        <w:t>方案</w:t>
-      </w:r>
-      <w:r>
-        <w:rPr>
-          <w:rFonts w:hint="default" w:ascii="Times New Roman" w:hAnsi="Times New Roman" w:eastAsia="宋体" w:cs="Times New Roman"/>
-          <w:sz w:val="24"/>
-          <w:szCs w:val="24"/>
-          <w:lang w:val="en-US" w:eastAsia="zh-CN"/>
-        </w:rPr>
-        <w:t>设计</w:t>
-      </w:r>
-      <w:r>
-        <w:rPr>
-          <w:rFonts w:hint="default" w:ascii="Times New Roman" w:hAnsi="Times New Roman" w:eastAsia="宋体" w:cs="Times New Roman"/>
-          <w:sz w:val="24"/>
-          <w:szCs w:val="24"/>
-          <w:lang w:eastAsia="zh-CN"/>
-        </w:rPr>
-        <w:t>。</w:t>
-      </w:r>
-    </w:p>
-    <w:p>
-      <w:pPr>
-        <w:spacing w:line="300" w:lineRule="auto"/>
-        <w:ind w:firstLine="480"/>
-        <w:rPr>
-          <w:rFonts w:hint="default" w:ascii="Times New Roman" w:hAnsi="Times New Roman" w:eastAsia="宋体" w:cs="Times New Roman"/>
-          <w:sz w:val="24"/>
-          <w:szCs w:val="24"/>
-          <w:lang w:eastAsia="zh-CN"/>
-        </w:rPr>
-      </w:pPr>
-      <w:r>
-        <w:rPr>
-          <w:rFonts w:hint="default" w:ascii="Times New Roman" w:hAnsi="Times New Roman" w:eastAsia="宋体" w:cs="Times New Roman"/>
-          <w:b/>
-          <w:bCs/>
-          <w:sz w:val="24"/>
-          <w:szCs w:val="24"/>
-        </w:rPr>
-        <w:t>课程目标4：</w:t>
-      </w:r>
-      <w:r>
-        <w:rPr>
-          <w:rFonts w:hint="default" w:ascii="Times New Roman" w:hAnsi="Times New Roman" w:eastAsia="宋体" w:cs="Times New Roman"/>
-          <w:sz w:val="24"/>
-          <w:szCs w:val="24"/>
-        </w:rPr>
-        <w:t>掌握</w:t>
-      </w:r>
-      <w:r>
-        <w:rPr>
-          <w:rFonts w:hint="default" w:ascii="Times New Roman" w:hAnsi="Times New Roman" w:eastAsia="宋体" w:cs="Times New Roman"/>
-          <w:sz w:val="24"/>
-          <w:szCs w:val="24"/>
-          <w:lang w:val="en-US" w:eastAsia="zh-CN"/>
-        </w:rPr>
-        <w:t>通过</w:t>
-      </w:r>
-      <w:r>
-        <w:rPr>
-          <w:rFonts w:hint="default" w:ascii="Times New Roman" w:hAnsi="Times New Roman" w:eastAsia="宋体" w:cs="Times New Roman"/>
-          <w:sz w:val="24"/>
-          <w:szCs w:val="24"/>
-        </w:rPr>
-        <w:t>实际机构测绘</w:t>
-      </w:r>
-      <w:r>
-        <w:rPr>
-          <w:rFonts w:hint="default" w:ascii="Times New Roman" w:hAnsi="Times New Roman" w:eastAsia="宋体" w:cs="Times New Roman"/>
-          <w:sz w:val="24"/>
-          <w:szCs w:val="24"/>
-          <w:lang w:val="en-US" w:eastAsia="zh-CN"/>
-        </w:rPr>
-        <w:t>绘制机构</w:t>
-      </w:r>
-      <w:r>
-        <w:rPr>
-          <w:rFonts w:hint="default" w:ascii="Times New Roman" w:hAnsi="Times New Roman" w:eastAsia="宋体" w:cs="Times New Roman"/>
-          <w:sz w:val="24"/>
-          <w:szCs w:val="24"/>
-        </w:rPr>
-        <w:t>运动简图的</w:t>
-      </w:r>
-      <w:r>
-        <w:rPr>
-          <w:rFonts w:hint="default" w:ascii="Times New Roman" w:hAnsi="Times New Roman" w:eastAsia="宋体" w:cs="Times New Roman"/>
-          <w:sz w:val="24"/>
-          <w:szCs w:val="24"/>
-          <w:lang w:val="en-US" w:eastAsia="zh-CN"/>
-        </w:rPr>
-        <w:t>方法</w:t>
-      </w:r>
-      <w:r>
-        <w:rPr>
-          <w:rFonts w:hint="default" w:ascii="Times New Roman" w:hAnsi="Times New Roman" w:eastAsia="宋体" w:cs="Times New Roman"/>
-          <w:sz w:val="24"/>
-          <w:szCs w:val="24"/>
-        </w:rPr>
-        <w:t>；掌握渐开线齿轮基本参数测定的基本方法；了解机构结构参数对运动情况的影响、机械原理常用机构的参数及优化设计方法；掌握流水线中常用机械机构设计方法，并验证机构的运动与动力计算分析</w:t>
-      </w:r>
-      <w:r>
-        <w:rPr>
-          <w:rFonts w:hint="default" w:ascii="Times New Roman" w:hAnsi="Times New Roman" w:eastAsia="宋体" w:cs="Times New Roman"/>
-          <w:sz w:val="24"/>
-          <w:szCs w:val="24"/>
-          <w:lang w:eastAsia="zh-CN"/>
-        </w:rPr>
-        <w:t>。</w:t>
-      </w:r>
-      <w:r>
-        <w:rPr>
-          <w:rFonts w:hint="default" w:ascii="Times New Roman" w:hAnsi="Times New Roman" w:eastAsia="宋体" w:cs="Times New Roman"/>
-          <w:sz w:val="24"/>
-          <w:szCs w:val="24"/>
-          <w:lang w:val="en-US" w:eastAsia="zh-CN"/>
-        </w:rPr>
-        <w:t>能够以机构运动简图表达机构运动特征，获得对</w:t>
-      </w:r>
-      <w:r>
-        <w:rPr>
-          <w:rFonts w:hint="default" w:ascii="Times New Roman" w:hAnsi="Times New Roman" w:eastAsia="宋体" w:cs="Times New Roman"/>
-          <w:sz w:val="24"/>
-          <w:szCs w:val="24"/>
-        </w:rPr>
-        <w:t>常见</w:t>
-      </w:r>
-      <w:r>
-        <w:rPr>
-          <w:rFonts w:hint="default" w:ascii="Times New Roman" w:hAnsi="Times New Roman" w:eastAsia="宋体" w:cs="Times New Roman"/>
-          <w:sz w:val="24"/>
-          <w:szCs w:val="24"/>
-          <w:lang w:val="en-US" w:eastAsia="zh-CN"/>
-        </w:rPr>
-        <w:t>机构基本参数和</w:t>
-      </w:r>
-      <w:r>
-        <w:rPr>
-          <w:rFonts w:hint="default" w:ascii="Times New Roman" w:hAnsi="Times New Roman" w:eastAsia="宋体" w:cs="Times New Roman"/>
-          <w:sz w:val="24"/>
-          <w:szCs w:val="24"/>
-        </w:rPr>
-        <w:t>运动问题进行综合分析的能力。</w:t>
       </w:r>
     </w:p>
     <w:p>
@@ -3182,51 +2557,32 @@
       </w:r>
       <w:r>
         <w:rPr>
+          <w:rFonts w:hint="eastAsia" w:cs="Times New Roman"/>
+          <w:b/>
+          <w:sz w:val="24"/>
+          <w:szCs w:val="24"/>
+          <w:lang w:val="en-US" w:eastAsia="zh-CN"/>
+        </w:rPr>
+        <w:t>xxxxx</w:t>
+      </w:r>
+      <w:r>
+        <w:rPr>
           <w:rFonts w:hint="default" w:ascii="Times New Roman" w:hAnsi="Times New Roman" w:eastAsia="宋体" w:cs="Times New Roman"/>
           <w:b/>
           <w:sz w:val="24"/>
           <w:szCs w:val="24"/>
+        </w:rPr>
+        <w:t>（</w:t>
+      </w:r>
+      <w:r>
+        <w:rPr>
+          <w:rFonts w:hint="eastAsia" w:cs="Times New Roman"/>
+          <w:b/>
+          <w:sz w:val="24"/>
+          <w:szCs w:val="24"/>
           <w:lang w:val="en-US" w:eastAsia="zh-CN"/>
         </w:rPr>
-        <w:t>机构组成与</w:t>
-      </w:r>
-      <w:r>
-        <w:rPr>
-          <w:rFonts w:hint="default" w:ascii="Times New Roman" w:hAnsi="Times New Roman" w:eastAsia="宋体" w:cs="Times New Roman"/>
-          <w:b/>
-          <w:sz w:val="24"/>
-          <w:szCs w:val="24"/>
-        </w:rPr>
-        <w:t>结构</w:t>
-      </w:r>
-      <w:r>
-        <w:rPr>
-          <w:rFonts w:hint="default" w:ascii="Times New Roman" w:hAnsi="Times New Roman" w:eastAsia="宋体" w:cs="Times New Roman"/>
-          <w:b/>
-          <w:sz w:val="24"/>
-          <w:szCs w:val="24"/>
-          <w:lang w:val="en-US" w:eastAsia="zh-CN"/>
-        </w:rPr>
-        <w:t>分析</w:t>
-      </w:r>
-      <w:r>
-        <w:rPr>
-          <w:rFonts w:hint="default" w:ascii="Times New Roman" w:hAnsi="Times New Roman" w:eastAsia="宋体" w:cs="Times New Roman"/>
-          <w:b/>
-          <w:sz w:val="24"/>
-          <w:szCs w:val="24"/>
-        </w:rPr>
-        <w:t>（</w:t>
-      </w:r>
-      <w:r>
-        <w:rPr>
-          <w:rFonts w:hint="default" w:ascii="Times New Roman" w:hAnsi="Times New Roman" w:eastAsia="宋体" w:cs="Times New Roman"/>
-          <w:b/>
-          <w:sz w:val="24"/>
-          <w:szCs w:val="24"/>
-          <w:lang w:val="en-US" w:eastAsia="zh-CN"/>
-        </w:rPr>
-        <w:t>10</w:t>
+        <w:t>xx</w:t>
       </w:r>
       <w:r>
         <w:rPr>
@@ -3279,7 +2635,7 @@
           <w:sz w:val="24"/>
           <w:szCs w:val="24"/>
         </w:rPr>
-        <w:t>（1）明确本课程研究的对象和内容，以及在培养高级工程技术人才全局中的地位、任务和作用，对机械原理学科的发展趋势有所了解。</w:t>
+        <w:t>（1）。</w:t>
       </w:r>
     </w:p>
     <w:p>
@@ -3299,7 +2655,7 @@
           <w:sz w:val="24"/>
           <w:szCs w:val="24"/>
         </w:rPr>
-        <w:t>（2）掌握机构运动简图的绘制方法，掌握平面机构自由度的计算及运动确定性的判断。</w:t>
+        <w:t>（2）。</w:t>
       </w:r>
     </w:p>
     <w:p>
@@ -3321,23 +2677,6 @@
         </w:rPr>
         <w:t>（3）</w:t>
       </w:r>
-      <w:r>
-        <w:rPr>
-          <w:rFonts w:hint="default" w:ascii="Times New Roman" w:hAnsi="Times New Roman" w:eastAsia="宋体" w:cs="Times New Roman"/>
-          <w:sz w:val="24"/>
-          <w:szCs w:val="24"/>
-          <w:lang w:val="en-US" w:eastAsia="zh-CN"/>
-        </w:rPr>
-        <w:t>掌握</w:t>
-      </w:r>
-      <w:r>
-        <w:rPr>
-          <w:rFonts w:hint="default" w:ascii="Times New Roman" w:hAnsi="Times New Roman" w:eastAsia="宋体" w:cs="Times New Roman"/>
-          <w:sz w:val="24"/>
-          <w:szCs w:val="24"/>
-        </w:rPr>
-        <w:t>机构的组成原理和结构分析的方法。</w:t>
-      </w:r>
     </w:p>
     <w:p>
       <w:pPr>
@@ -3400,7 +2739,41 @@
           <w:sz w:val="24"/>
           <w:szCs w:val="24"/>
         </w:rPr>
-        <w:t>重点是机构运动简图的绘制及平面机构自由度的计算；难点是虚约束的识别和处理。</w:t>
+        <w:t>重点是</w:t>
+      </w:r>
+      <w:r>
+        <w:rPr>
+          <w:rFonts w:hint="eastAsia" w:cs="Times New Roman"/>
+          <w:sz w:val="24"/>
+          <w:szCs w:val="24"/>
+          <w:lang w:val="en-US" w:eastAsia="zh-CN"/>
+        </w:rPr>
+        <w:t>xxxxx</w:t>
+      </w:r>
+      <w:r>
+        <w:rPr>
+          <w:rFonts w:hint="default" w:ascii="Times New Roman" w:hAnsi="Times New Roman" w:eastAsia="宋体" w:cs="Times New Roman"/>
+          <w:sz w:val="24"/>
+          <w:szCs w:val="24"/>
+        </w:rPr>
+        <w:t>；难点是</w:t>
+      </w:r>
+      <w:r>
+        <w:rPr>
+          <w:rFonts w:hint="eastAsia" w:cs="Times New Roman"/>
+          <w:sz w:val="24"/>
+          <w:szCs w:val="24"/>
+          <w:lang w:val="en-US" w:eastAsia="zh-CN"/>
+        </w:rPr>
+        <w:t>xxxxx</w:t>
+      </w:r>
+      <w:r>
+        <w:rPr>
+          <w:rFonts w:hint="default" w:ascii="Times New Roman" w:hAnsi="Times New Roman" w:eastAsia="宋体" w:cs="Times New Roman"/>
+          <w:sz w:val="24"/>
+          <w:szCs w:val="24"/>
+        </w:rPr>
+        <w:t>。</w:t>
       </w:r>
     </w:p>
     <w:p>
@@ -3490,26 +2863,31 @@
     <w:p>
       <w:pPr>
         <w:spacing w:after="0" w:line="300" w:lineRule="auto"/>
-        <w:ind w:firstLine="480" w:firstLineChars="200"/>
+        <w:ind w:firstLine="482" w:firstLineChars="200"/>
         <w:jc w:val="both"/>
         <w:rPr>
-          <w:rFonts w:hint="eastAsia" w:cs="Times New Roman"/>
-          <w:color w:val="FF0000"/>
-          <w:sz w:val="24"/>
-          <w:szCs w:val="24"/>
-          <w:lang w:eastAsia="zh-CN"/>
+          <w:rFonts w:hint="default" w:ascii="Times New Roman" w:hAnsi="Times New Roman" w:eastAsia="宋体" w:cs="Times New Roman"/>
+          <w:b/>
+          <w:bCs/>
+          <w:sz w:val="24"/>
+          <w:szCs w:val="24"/>
         </w:rPr>
       </w:pPr>
-      <w:r>
-        <w:rPr>
-          <w:rFonts w:hint="eastAsia" w:cs="Times New Roman"/>
-          <w:color w:val="FF0000"/>
-          <w:sz w:val="24"/>
-          <w:szCs w:val="24"/>
-          <w:lang w:eastAsia="zh-CN"/>
-        </w:rPr>
-        <w:t>……</w:t>
-      </w:r>
+      <w:bookmarkStart w:id="2" w:name="_GoBack"/>
+      <w:bookmarkEnd w:id="2"/>
+    </w:p>
+    <w:p>
+      <w:pPr>
+        <w:spacing w:after="0" w:line="300" w:lineRule="auto"/>
+        <w:ind w:firstLine="482" w:firstLineChars="200"/>
+        <w:jc w:val="both"/>
+        <w:rPr>
+          <w:rFonts w:hint="default" w:ascii="Times New Roman" w:hAnsi="Times New Roman" w:eastAsia="宋体" w:cs="Times New Roman"/>
+          <w:b/>
+          <w:sz w:val="24"/>
+          <w:szCs w:val="24"/>
+        </w:rPr>
+      </w:pPr>
     </w:p>
     <w:p>
       <w:pPr>
@@ -5401,7 +4779,7 @@
         <w:widowControl w:val="0"/>
         <w:numPr>
           <w:ilvl w:val="0"/>
-          <w:numId w:val="3"/>
+          <w:numId w:val="4"/>
         </w:numPr>
         <w:kinsoku/>
         <w:wordWrap/>
@@ -21897,6 +21275,18 @@
     </w:lvl>
   </w:abstractNum>
   <w:abstractNum w:abstractNumId="2">
+    <w:nsid w:val="49E7EBFF"/>
+    <w:multiLevelType w:val="singleLevel"/>
+    <w:tmpl w:val="49E7EBFF"/>
+    <w:lvl w:ilvl="0" w:tentative="0">
+      <w:start w:val="1"/>
+      <w:numFmt w:val="decimal"/>
+      <w:suff w:val="space"/>
+      <w:lvlText w:val="%1."/>
+      <w:lvlJc w:val="left"/>
+    </w:lvl>
+  </w:abstractNum>
+  <w:abstractNum w:abstractNumId="3">
     <w:nsid w:val="7272CE61"/>
     <w:multiLevelType w:val="singleLevel"/>
     <w:tmpl w:val="7272CE61"/>
@@ -21917,12 +21307,15 @@
     </w:lvl>
   </w:abstractNum>
   <w:num w:numId="1">
+    <w:abstractNumId w:val="3"/>
+  </w:num>
+  <w:num w:numId="2">
     <w:abstractNumId w:val="2"/>
   </w:num>
-  <w:num w:numId="2">
+  <w:num w:numId="3">
     <w:abstractNumId w:val="0"/>
   </w:num>
-  <w:num w:numId="3">
+  <w:num w:numId="4">
     <w:abstractNumId w:val="1"/>
   </w:num>
 </w:numbering>

</xml_diff>